<commit_message>
Add R@10 to the report, and the split-leakage section
The results table carried nDCG@10 alone. R@10 changes how the out-of-domain
loss reads: on msmarco bge-m3 drops 9-10 points of nDCG@10 and over 13 of R@1,
but only 4-6 of R@10, and R@100 barely moves (0.977 -> 0.966-0.974). The
degradation is of ordering, not of retrieval - the model still knows where the
answer is, it is less certain the answer is first. In domain R@10 is saturated
after training, 0.98-1.00 everywhere with R@100 at exactly 1.000, so on
corpora of 3300-3700 passages it no longer discriminates.

Nothing was rerun: recall@10 was computed and stored on every evaluation from
the start, alongside recall@1 and recall@100.

Also adds the split-leakage measurement the mentors prompted - 21% of test
positives are the same story as a training positive, and the cleaned-test
control showing the gain is unchanged.

Co-Authored-By: Claude Opus 5 <noreply@anthropic.com>
</commit_message>
<xml_diff>
--- a/results/raport_roretrieval.docx
+++ b/results/raport_roretrieval.docx
@@ -84,7 +84,7 @@
         <w:t xml:space="preserve">Evaluări</w:t>
       </w:r>
       <w:r>
-        <w:t xml:space="preserve"> 18, pe 2 modele</w:t>
+        <w:t xml:space="preserve"> 22, pe 2 modele</w:t>
       </w:r>
       <w:r>
         <w:t xml:space="preserve"> </w:t>
@@ -2497,10 +2497,12 @@
         <w:tblW w:w="5000" w:type="pct"/>
       </w:tblPr>
       <w:tblGrid>
-        <w:gridCol w:w="2340"/>
-        <w:gridCol w:w="2340"/>
-        <w:gridCol w:w="2340"/>
-        <w:gridCol w:w="2340"/>
+        <w:gridCol w:w="1560"/>
+        <w:gridCol w:w="1560"/>
+        <w:gridCol w:w="1560"/>
+        <w:gridCol w:w="1560"/>
+        <w:gridCol w:w="1560"/>
+        <w:gridCol w:w="1560"/>
       </w:tblGrid>
       <w:tr>
         <w:trPr>
@@ -2508,7 +2510,7 @@
         </w:trPr>
         <w:tc>
           <w:tcPr>
-            <w:tcW w:w="2340" w:type="dxa"/>
+            <w:tcW w:w="1560" w:type="dxa"/>
             <w:shd w:val="clear" w:fill="F2F2F2"/>
           </w:tcPr>
           <w:p>
@@ -2525,7 +2527,7 @@
         </w:tc>
         <w:tc>
           <w:tcPr>
-            <w:tcW w:w="2340" w:type="dxa"/>
+            <w:tcW w:w="1560" w:type="dxa"/>
             <w:shd w:val="clear" w:fill="F2F2F2"/>
           </w:tcPr>
           <w:p>
@@ -2542,7 +2544,7 @@
         </w:tc>
         <w:tc>
           <w:tcPr>
-            <w:tcW w:w="2340" w:type="dxa"/>
+            <w:tcW w:w="1560" w:type="dxa"/>
             <w:shd w:val="clear" w:fill="F2F2F2"/>
           </w:tcPr>
           <w:p>
@@ -2555,30 +2557,112 @@
               </w:rPr>
               <w:t xml:space="preserve">în domeniu</w:t>
             </w:r>
-          </w:p>
-        </w:tc>
-        <w:tc>
-          <w:tcPr>
-            <w:tcW w:w="2340" w:type="dxa"/>
-            <w:shd w:val="clear" w:fill="F2F2F2"/>
-          </w:tcPr>
-          <w:p>
-            <w:pPr>
-              <w:pStyle w:val="Normal"/>
-            </w:pPr>
             <w:r>
               <w:rPr>
                 <w:b/>
               </w:rPr>
-              <w:t xml:space="preserve">ro-msmarco</w:t>
-            </w:r>
-          </w:p>
-        </w:tc>
-      </w:tr>
-      <w:tr>
-        <w:tc>
-          <w:tcPr>
-            <w:tcW w:w="2340" w:type="dxa"/>
+              <w:t xml:space="preserve"> </w:t>
+            </w:r>
+            <w:r>
+              <w:rPr>
+                <w:b/>
+              </w:rPr>
+              <w:t xml:space="preserve">nDCG@10</w:t>
+            </w:r>
+          </w:p>
+        </w:tc>
+        <w:tc>
+          <w:tcPr>
+            <w:tcW w:w="1560" w:type="dxa"/>
+            <w:shd w:val="clear" w:fill="F2F2F2"/>
+          </w:tcPr>
+          <w:p>
+            <w:pPr>
+              <w:pStyle w:val="Normal"/>
+            </w:pPr>
+            <w:r>
+              <w:rPr>
+                <w:b/>
+              </w:rPr>
+              <w:t xml:space="preserve">în domeniu</w:t>
+            </w:r>
+            <w:r>
+              <w:rPr>
+                <w:b/>
+              </w:rPr>
+              <w:t xml:space="preserve"> </w:t>
+            </w:r>
+            <w:r>
+              <w:rPr>
+                <w:b/>
+              </w:rPr>
+              <w:t xml:space="preserve">R@10</w:t>
+            </w:r>
+          </w:p>
+        </w:tc>
+        <w:tc>
+          <w:tcPr>
+            <w:tcW w:w="1560" w:type="dxa"/>
+            <w:shd w:val="clear" w:fill="F2F2F2"/>
+          </w:tcPr>
+          <w:p>
+            <w:pPr>
+              <w:pStyle w:val="Normal"/>
+            </w:pPr>
+            <w:r>
+              <w:rPr>
+                <w:b/>
+              </w:rPr>
+              <w:t xml:space="preserve">msmarco</w:t>
+            </w:r>
+            <w:r>
+              <w:rPr>
+                <w:b/>
+              </w:rPr>
+              <w:t xml:space="preserve"> </w:t>
+            </w:r>
+            <w:r>
+              <w:rPr>
+                <w:b/>
+              </w:rPr>
+              <w:t xml:space="preserve">nDCG@10</w:t>
+            </w:r>
+          </w:p>
+        </w:tc>
+        <w:tc>
+          <w:tcPr>
+            <w:tcW w:w="1560" w:type="dxa"/>
+            <w:shd w:val="clear" w:fill="F2F2F2"/>
+          </w:tcPr>
+          <w:p>
+            <w:pPr>
+              <w:pStyle w:val="Normal"/>
+            </w:pPr>
+            <w:r>
+              <w:rPr>
+                <w:b/>
+              </w:rPr>
+              <w:t xml:space="preserve">msmarco</w:t>
+            </w:r>
+            <w:r>
+              <w:rPr>
+                <w:b/>
+              </w:rPr>
+              <w:t xml:space="preserve"> </w:t>
+            </w:r>
+            <w:r>
+              <w:rPr>
+                <w:b/>
+              </w:rPr>
+              <w:t xml:space="preserve">R@10</w:t>
+            </w:r>
+          </w:p>
+        </w:tc>
+      </w:tr>
+      <w:tr>
+        <w:tc>
+          <w:tcPr>
+            <w:tcW w:w="1560" w:type="dxa"/>
           </w:tcPr>
           <w:p>
             <w:pPr>
@@ -2591,7 +2675,7 @@
         </w:tc>
         <w:tc>
           <w:tcPr>
-            <w:tcW w:w="2340" w:type="dxa"/>
+            <w:tcW w:w="1560" w:type="dxa"/>
           </w:tcPr>
           <w:p>
             <w:pPr>
@@ -2604,7 +2688,7 @@
         </w:tc>
         <w:tc>
           <w:tcPr>
-            <w:tcW w:w="2340" w:type="dxa"/>
+            <w:tcW w:w="1560" w:type="dxa"/>
           </w:tcPr>
           <w:p>
             <w:pPr>
@@ -2617,7 +2701,20 @@
         </w:tc>
         <w:tc>
           <w:tcPr>
-            <w:tcW w:w="2340" w:type="dxa"/>
+            <w:tcW w:w="1560" w:type="dxa"/>
+          </w:tcPr>
+          <w:p>
+            <w:pPr>
+              <w:pStyle w:val="Normal"/>
+            </w:pPr>
+            <w:r>
+              <w:t xml:space="preserve">0.947</w:t>
+            </w:r>
+          </w:p>
+        </w:tc>
+        <w:tc>
+          <w:tcPr>
+            <w:tcW w:w="1560" w:type="dxa"/>
           </w:tcPr>
           <w:p>
             <w:pPr>
@@ -2628,11 +2725,24 @@
             </w:r>
           </w:p>
         </w:tc>
-      </w:tr>
-      <w:tr>
-        <w:tc>
-          <w:tcPr>
-            <w:tcW w:w="2340" w:type="dxa"/>
+        <w:tc>
+          <w:tcPr>
+            <w:tcW w:w="1560" w:type="dxa"/>
+          </w:tcPr>
+          <w:p>
+            <w:pPr>
+              <w:pStyle w:val="Normal"/>
+            </w:pPr>
+            <w:r>
+              <w:t xml:space="preserve">0.875</w:t>
+            </w:r>
+          </w:p>
+        </w:tc>
+      </w:tr>
+      <w:tr>
+        <w:tc>
+          <w:tcPr>
+            <w:tcW w:w="1560" w:type="dxa"/>
           </w:tcPr>
           <w:p>
             <w:pPr>
@@ -2645,7 +2755,7 @@
         </w:tc>
         <w:tc>
           <w:tcPr>
-            <w:tcW w:w="2340" w:type="dxa"/>
+            <w:tcW w:w="1560" w:type="dxa"/>
           </w:tcPr>
           <w:p>
             <w:pPr>
@@ -2658,7 +2768,7 @@
         </w:tc>
         <w:tc>
           <w:tcPr>
-            <w:tcW w:w="2340" w:type="dxa"/>
+            <w:tcW w:w="1560" w:type="dxa"/>
           </w:tcPr>
           <w:p>
             <w:pPr>
@@ -2671,7 +2781,20 @@
         </w:tc>
         <w:tc>
           <w:tcPr>
-            <w:tcW w:w="2340" w:type="dxa"/>
+            <w:tcW w:w="1560" w:type="dxa"/>
+          </w:tcPr>
+          <w:p>
+            <w:pPr>
+              <w:pStyle w:val="Normal"/>
+            </w:pPr>
+            <w:r>
+              <w:t xml:space="preserve">0.986</w:t>
+            </w:r>
+          </w:p>
+        </w:tc>
+        <w:tc>
+          <w:tcPr>
+            <w:tcW w:w="1560" w:type="dxa"/>
           </w:tcPr>
           <w:p>
             <w:pPr>
@@ -2682,11 +2805,24 @@
             </w:r>
           </w:p>
         </w:tc>
-      </w:tr>
-      <w:tr>
-        <w:tc>
-          <w:tcPr>
-            <w:tcW w:w="2340" w:type="dxa"/>
+        <w:tc>
+          <w:tcPr>
+            <w:tcW w:w="1560" w:type="dxa"/>
+          </w:tcPr>
+          <w:p>
+            <w:pPr>
+              <w:pStyle w:val="Normal"/>
+            </w:pPr>
+            <w:r>
+              <w:t xml:space="preserve">0.813</w:t>
+            </w:r>
+          </w:p>
+        </w:tc>
+      </w:tr>
+      <w:tr>
+        <w:tc>
+          <w:tcPr>
+            <w:tcW w:w="1560" w:type="dxa"/>
           </w:tcPr>
           <w:p>
             <w:pPr>
@@ -2699,7 +2835,7 @@
         </w:tc>
         <w:tc>
           <w:tcPr>
-            <w:tcW w:w="2340" w:type="dxa"/>
+            <w:tcW w:w="1560" w:type="dxa"/>
           </w:tcPr>
           <w:p>
             <w:pPr>
@@ -2712,7 +2848,7 @@
         </w:tc>
         <w:tc>
           <w:tcPr>
-            <w:tcW w:w="2340" w:type="dxa"/>
+            <w:tcW w:w="1560" w:type="dxa"/>
           </w:tcPr>
           <w:p>
             <w:pPr>
@@ -2725,7 +2861,20 @@
         </w:tc>
         <w:tc>
           <w:tcPr>
-            <w:tcW w:w="2340" w:type="dxa"/>
+            <w:tcW w:w="1560" w:type="dxa"/>
+          </w:tcPr>
+          <w:p>
+            <w:pPr>
+              <w:pStyle w:val="Normal"/>
+            </w:pPr>
+            <w:r>
+              <w:t xml:space="preserve">0.978</w:t>
+            </w:r>
+          </w:p>
+        </w:tc>
+        <w:tc>
+          <w:tcPr>
+            <w:tcW w:w="1560" w:type="dxa"/>
           </w:tcPr>
           <w:p>
             <w:pPr>
@@ -2736,11 +2885,24 @@
             </w:r>
           </w:p>
         </w:tc>
-      </w:tr>
-      <w:tr>
-        <w:tc>
-          <w:tcPr>
-            <w:tcW w:w="2340" w:type="dxa"/>
+        <w:tc>
+          <w:tcPr>
+            <w:tcW w:w="1560" w:type="dxa"/>
+          </w:tcPr>
+          <w:p>
+            <w:pPr>
+              <w:pStyle w:val="Normal"/>
+            </w:pPr>
+            <w:r>
+              <w:t xml:space="preserve">0.820</w:t>
+            </w:r>
+          </w:p>
+        </w:tc>
+      </w:tr>
+      <w:tr>
+        <w:tc>
+          <w:tcPr>
+            <w:tcW w:w="1560" w:type="dxa"/>
           </w:tcPr>
           <w:p>
             <w:pPr>
@@ -2753,7 +2915,7 @@
         </w:tc>
         <w:tc>
           <w:tcPr>
-            <w:tcW w:w="2340" w:type="dxa"/>
+            <w:tcW w:w="1560" w:type="dxa"/>
           </w:tcPr>
           <w:p>
             <w:pPr>
@@ -2766,7 +2928,7 @@
         </w:tc>
         <w:tc>
           <w:tcPr>
-            <w:tcW w:w="2340" w:type="dxa"/>
+            <w:tcW w:w="1560" w:type="dxa"/>
           </w:tcPr>
           <w:p>
             <w:pPr>
@@ -2779,7 +2941,20 @@
         </w:tc>
         <w:tc>
           <w:tcPr>
-            <w:tcW w:w="2340" w:type="dxa"/>
+            <w:tcW w:w="1560" w:type="dxa"/>
+          </w:tcPr>
+          <w:p>
+            <w:pPr>
+              <w:pStyle w:val="Normal"/>
+            </w:pPr>
+            <w:r>
+              <w:t xml:space="preserve">0.965</w:t>
+            </w:r>
+          </w:p>
+        </w:tc>
+        <w:tc>
+          <w:tcPr>
+            <w:tcW w:w="1560" w:type="dxa"/>
           </w:tcPr>
           <w:p>
             <w:pPr>
@@ -2790,11 +2965,24 @@
             </w:r>
           </w:p>
         </w:tc>
-      </w:tr>
-      <w:tr>
-        <w:tc>
-          <w:tcPr>
-            <w:tcW w:w="2340" w:type="dxa"/>
+        <w:tc>
+          <w:tcPr>
+            <w:tcW w:w="1560" w:type="dxa"/>
+          </w:tcPr>
+          <w:p>
+            <w:pPr>
+              <w:pStyle w:val="Normal"/>
+            </w:pPr>
+            <w:r>
+              <w:t xml:space="preserve">0.899</w:t>
+            </w:r>
+          </w:p>
+        </w:tc>
+      </w:tr>
+      <w:tr>
+        <w:tc>
+          <w:tcPr>
+            <w:tcW w:w="1560" w:type="dxa"/>
           </w:tcPr>
           <w:p>
             <w:pPr>
@@ -2807,7 +2995,7 @@
         </w:tc>
         <w:tc>
           <w:tcPr>
-            <w:tcW w:w="2340" w:type="dxa"/>
+            <w:tcW w:w="1560" w:type="dxa"/>
           </w:tcPr>
           <w:p>
             <w:pPr>
@@ -2820,7 +3008,7 @@
         </w:tc>
         <w:tc>
           <w:tcPr>
-            <w:tcW w:w="2340" w:type="dxa"/>
+            <w:tcW w:w="1560" w:type="dxa"/>
           </w:tcPr>
           <w:p>
             <w:pPr>
@@ -2833,7 +3021,20 @@
         </w:tc>
         <w:tc>
           <w:tcPr>
-            <w:tcW w:w="2340" w:type="dxa"/>
+            <w:tcW w:w="1560" w:type="dxa"/>
+          </w:tcPr>
+          <w:p>
+            <w:pPr>
+              <w:pStyle w:val="Normal"/>
+            </w:pPr>
+            <w:r>
+              <w:t xml:space="preserve">0.988</w:t>
+            </w:r>
+          </w:p>
+        </w:tc>
+        <w:tc>
+          <w:tcPr>
+            <w:tcW w:w="1560" w:type="dxa"/>
           </w:tcPr>
           <w:p>
             <w:pPr>
@@ -2844,11 +3045,24 @@
             </w:r>
           </w:p>
         </w:tc>
-      </w:tr>
-      <w:tr>
-        <w:tc>
-          <w:tcPr>
-            <w:tcW w:w="2340" w:type="dxa"/>
+        <w:tc>
+          <w:tcPr>
+            <w:tcW w:w="1560" w:type="dxa"/>
+          </w:tcPr>
+          <w:p>
+            <w:pPr>
+              <w:pStyle w:val="Normal"/>
+            </w:pPr>
+            <w:r>
+              <w:t xml:space="preserve">0.862</w:t>
+            </w:r>
+          </w:p>
+        </w:tc>
+      </w:tr>
+      <w:tr>
+        <w:tc>
+          <w:tcPr>
+            <w:tcW w:w="1560" w:type="dxa"/>
           </w:tcPr>
           <w:p>
             <w:pPr>
@@ -2861,7 +3075,7 @@
         </w:tc>
         <w:tc>
           <w:tcPr>
-            <w:tcW w:w="2340" w:type="dxa"/>
+            <w:tcW w:w="1560" w:type="dxa"/>
           </w:tcPr>
           <w:p>
             <w:pPr>
@@ -2874,7 +3088,7 @@
         </w:tc>
         <w:tc>
           <w:tcPr>
-            <w:tcW w:w="2340" w:type="dxa"/>
+            <w:tcW w:w="1560" w:type="dxa"/>
           </w:tcPr>
           <w:p>
             <w:pPr>
@@ -2887,7 +3101,20 @@
         </w:tc>
         <w:tc>
           <w:tcPr>
-            <w:tcW w:w="2340" w:type="dxa"/>
+            <w:tcW w:w="1560" w:type="dxa"/>
+          </w:tcPr>
+          <w:p>
+            <w:pPr>
+              <w:pStyle w:val="Normal"/>
+            </w:pPr>
+            <w:r>
+              <w:t xml:space="preserve">0.983</w:t>
+            </w:r>
+          </w:p>
+        </w:tc>
+        <w:tc>
+          <w:tcPr>
+            <w:tcW w:w="1560" w:type="dxa"/>
           </w:tcPr>
           <w:p>
             <w:pPr>
@@ -2898,11 +3125,24 @@
             </w:r>
           </w:p>
         </w:tc>
-      </w:tr>
-      <w:tr>
-        <w:tc>
-          <w:tcPr>
-            <w:tcW w:w="2340" w:type="dxa"/>
+        <w:tc>
+          <w:tcPr>
+            <w:tcW w:w="1560" w:type="dxa"/>
+          </w:tcPr>
+          <w:p>
+            <w:pPr>
+              <w:pStyle w:val="Normal"/>
+            </w:pPr>
+            <w:r>
+              <w:t xml:space="preserve">0.875</w:t>
+            </w:r>
+          </w:p>
+        </w:tc>
+      </w:tr>
+      <w:tr>
+        <w:tc>
+          <w:tcPr>
+            <w:tcW w:w="1560" w:type="dxa"/>
           </w:tcPr>
           <w:p>
             <w:pPr>
@@ -2915,7 +3155,7 @@
         </w:tc>
         <w:tc>
           <w:tcPr>
-            <w:tcW w:w="2340" w:type="dxa"/>
+            <w:tcW w:w="1560" w:type="dxa"/>
           </w:tcPr>
           <w:p>
             <w:pPr>
@@ -2928,7 +3168,7 @@
         </w:tc>
         <w:tc>
           <w:tcPr>
-            <w:tcW w:w="2340" w:type="dxa"/>
+            <w:tcW w:w="1560" w:type="dxa"/>
           </w:tcPr>
           <w:p>
             <w:pPr>
@@ -2941,7 +3181,20 @@
         </w:tc>
         <w:tc>
           <w:tcPr>
-            <w:tcW w:w="2340" w:type="dxa"/>
+            <w:tcW w:w="1560" w:type="dxa"/>
+          </w:tcPr>
+          <w:p>
+            <w:pPr>
+              <w:pStyle w:val="Normal"/>
+            </w:pPr>
+            <w:r>
+              <w:t xml:space="preserve">0.997</w:t>
+            </w:r>
+          </w:p>
+        </w:tc>
+        <w:tc>
+          <w:tcPr>
+            <w:tcW w:w="1560" w:type="dxa"/>
           </w:tcPr>
           <w:p>
             <w:pPr>
@@ -2952,11 +3205,24 @@
             </w:r>
           </w:p>
         </w:tc>
-      </w:tr>
-      <w:tr>
-        <w:tc>
-          <w:tcPr>
-            <w:tcW w:w="2340" w:type="dxa"/>
+        <w:tc>
+          <w:tcPr>
+            <w:tcW w:w="1560" w:type="dxa"/>
+          </w:tcPr>
+          <w:p>
+            <w:pPr>
+              <w:pStyle w:val="Normal"/>
+            </w:pPr>
+            <w:r>
+              <w:t xml:space="preserve">0.833</w:t>
+            </w:r>
+          </w:p>
+        </w:tc>
+      </w:tr>
+      <w:tr>
+        <w:tc>
+          <w:tcPr>
+            <w:tcW w:w="1560" w:type="dxa"/>
           </w:tcPr>
           <w:p>
             <w:pPr>
@@ -2969,7 +3235,7 @@
         </w:tc>
         <w:tc>
           <w:tcPr>
-            <w:tcW w:w="2340" w:type="dxa"/>
+            <w:tcW w:w="1560" w:type="dxa"/>
           </w:tcPr>
           <w:p>
             <w:pPr>
@@ -2982,7 +3248,7 @@
         </w:tc>
         <w:tc>
           <w:tcPr>
-            <w:tcW w:w="2340" w:type="dxa"/>
+            <w:tcW w:w="1560" w:type="dxa"/>
           </w:tcPr>
           <w:p>
             <w:pPr>
@@ -2995,7 +3261,20 @@
         </w:tc>
         <w:tc>
           <w:tcPr>
-            <w:tcW w:w="2340" w:type="dxa"/>
+            <w:tcW w:w="1560" w:type="dxa"/>
+          </w:tcPr>
+          <w:p>
+            <w:pPr>
+              <w:pStyle w:val="Normal"/>
+            </w:pPr>
+            <w:r>
+              <w:t xml:space="preserve">0.999</w:t>
+            </w:r>
+          </w:p>
+        </w:tc>
+        <w:tc>
+          <w:tcPr>
+            <w:tcW w:w="1560" w:type="dxa"/>
           </w:tcPr>
           <w:p>
             <w:pPr>
@@ -3006,11 +3285,24 @@
             </w:r>
           </w:p>
         </w:tc>
-      </w:tr>
-      <w:tr>
-        <w:tc>
-          <w:tcPr>
-            <w:tcW w:w="2340" w:type="dxa"/>
+        <w:tc>
+          <w:tcPr>
+            <w:tcW w:w="1560" w:type="dxa"/>
+          </w:tcPr>
+          <w:p>
+            <w:pPr>
+              <w:pStyle w:val="Normal"/>
+            </w:pPr>
+            <w:r>
+              <w:t xml:space="preserve">0.837</w:t>
+            </w:r>
+          </w:p>
+        </w:tc>
+      </w:tr>
+      <w:tr>
+        <w:tc>
+          <w:tcPr>
+            <w:tcW w:w="1560" w:type="dxa"/>
           </w:tcPr>
           <w:p>
             <w:pPr>
@@ -3023,7 +3315,7 @@
         </w:tc>
         <w:tc>
           <w:tcPr>
-            <w:tcW w:w="2340" w:type="dxa"/>
+            <w:tcW w:w="1560" w:type="dxa"/>
           </w:tcPr>
           <w:p>
             <w:pPr>
@@ -3036,7 +3328,7 @@
         </w:tc>
         <w:tc>
           <w:tcPr>
-            <w:tcW w:w="2340" w:type="dxa"/>
+            <w:tcW w:w="1560" w:type="dxa"/>
           </w:tcPr>
           <w:p>
             <w:pPr>
@@ -3049,7 +3341,20 @@
         </w:tc>
         <w:tc>
           <w:tcPr>
-            <w:tcW w:w="2340" w:type="dxa"/>
+            <w:tcW w:w="1560" w:type="dxa"/>
+          </w:tcPr>
+          <w:p>
+            <w:pPr>
+              <w:pStyle w:val="Normal"/>
+            </w:pPr>
+            <w:r>
+              <w:t xml:space="preserve">0.992</w:t>
+            </w:r>
+          </w:p>
+        </w:tc>
+        <w:tc>
+          <w:tcPr>
+            <w:tcW w:w="1560" w:type="dxa"/>
           </w:tcPr>
           <w:p>
             <w:pPr>
@@ -3060,11 +3365,24 @@
             </w:r>
           </w:p>
         </w:tc>
-      </w:tr>
-      <w:tr>
-        <w:tc>
-          <w:tcPr>
-            <w:tcW w:w="2340" w:type="dxa"/>
+        <w:tc>
+          <w:tcPr>
+            <w:tcW w:w="1560" w:type="dxa"/>
+          </w:tcPr>
+          <w:p>
+            <w:pPr>
+              <w:pStyle w:val="Normal"/>
+            </w:pPr>
+            <w:r>
+              <w:t xml:space="preserve">0.899</w:t>
+            </w:r>
+          </w:p>
+        </w:tc>
+      </w:tr>
+      <w:tr>
+        <w:tc>
+          <w:tcPr>
+            <w:tcW w:w="1560" w:type="dxa"/>
           </w:tcPr>
           <w:p>
             <w:pPr>
@@ -3077,7 +3395,7 @@
         </w:tc>
         <w:tc>
           <w:tcPr>
-            <w:tcW w:w="2340" w:type="dxa"/>
+            <w:tcW w:w="1560" w:type="dxa"/>
           </w:tcPr>
           <w:p>
             <w:pPr>
@@ -3090,7 +3408,7 @@
         </w:tc>
         <w:tc>
           <w:tcPr>
-            <w:tcW w:w="2340" w:type="dxa"/>
+            <w:tcW w:w="1560" w:type="dxa"/>
           </w:tcPr>
           <w:p>
             <w:pPr>
@@ -3103,7 +3421,20 @@
         </w:tc>
         <w:tc>
           <w:tcPr>
-            <w:tcW w:w="2340" w:type="dxa"/>
+            <w:tcW w:w="1560" w:type="dxa"/>
+          </w:tcPr>
+          <w:p>
+            <w:pPr>
+              <w:pStyle w:val="Normal"/>
+            </w:pPr>
+            <w:r>
+              <w:t xml:space="preserve">0.999</w:t>
+            </w:r>
+          </w:p>
+        </w:tc>
+        <w:tc>
+          <w:tcPr>
+            <w:tcW w:w="1560" w:type="dxa"/>
           </w:tcPr>
           <w:p>
             <w:pPr>
@@ -3111,6 +3442,19 @@
             </w:pPr>
             <w:r>
               <w:t xml:space="preserve">0.665</w:t>
+            </w:r>
+          </w:p>
+        </w:tc>
+        <w:tc>
+          <w:tcPr>
+            <w:tcW w:w="1560" w:type="dxa"/>
+          </w:tcPr>
+          <w:p>
+            <w:pPr>
+              <w:pStyle w:val="Normal"/>
+            </w:pPr>
+            <w:r>
+              <w:t xml:space="preserve">0.868</w:t>
             </w:r>
           </w:p>
         </w:tc>
@@ -3122,7 +3466,31 @@
         <w:pStyle w:val="Caption"/>
       </w:pPr>
       <w:r>
-        <w:t xml:space="preserve">nDCG@10. „În domeniu" e splitul de test al setului pe care s-a antrenat. Primele cinci rânduri privesc tripletele BM25, ultimele cinci pe cele cu interacțiune târzie.</w:t>
+        <w:t xml:space="preserve">„În domeniu" e splitul de test al setului pe care s-a antrenat. Primele cinci rânduri privesc tripletele BM25, ultimele cinci pe cele cu interacțiune târzie.</w:t>
+      </w:r>
+    </w:p>
+    <w:p>
+      <w:pPr>
+        <w:pStyle w:val="Normal"/>
+      </w:pPr>
+      <w:r>
+        <w:t xml:space="preserve">Citit prin R@10, degradarea e de ordonare, nu de regăsire.</w:t>
+      </w:r>
+    </w:p>
+    <w:p>
+      <w:pPr>
+        <w:pStyle w:val="Normal"/>
+      </w:pPr>
+      <w:r>
+        <w:t xml:space="preserve">Pe msmarco, bge-m3 pierde 9–10 puncte de nDCG@10 și peste 13 de R@1, dar doar 4–6 de R@10, iar R@100 abia se clintește: 0.977 → 0.966–0.974. Modelul încă știe unde e răspunsul; nu mai e la fel de sigur că el e primul. E o formă mai blândă de uitare decât sugerează nDCG singur.</w:t>
+      </w:r>
+    </w:p>
+    <w:p>
+      <w:pPr>
+        <w:pStyle w:val="Normal"/>
+      </w:pPr>
+      <w:r>
+        <w:t xml:space="preserve">În domeniu, R@10 e practic saturat după antrenare — 0.98–1.00 peste tot, iar R@100 e fix 1.000. Pe corpusuri de 3 300–3 700 de pasaje întrebarea „e răspunsul în primele zece" nu mai discriminează; acolo doar nDCG@10 și R@1 mai separă ceva.</w:t>
       </w:r>
     </w:p>
     <w:p>
@@ -3492,6 +3860,639 @@
       </w:pPr>
       <w:r>
         <w:t xml:space="preserve">Qwen conduce peste tot, cu 0.02–0.03 nDCG. Pentru asta: 7.6 miliarde de parametri față de 568 de milioane, 8 ore și 15 minute de antrenare față de 23 de minute, și 15 GB de checkpoint față de 2.2. Dacă proiectul trebuie să recomande ceva practic, bge-m3 e alegerea rațională.</w:t>
+      </w:r>
+    </w:p>
+    <w:p>
+      <w:pPr>
+        <w:pStyle w:val="Normal"/>
+      </w:pPr>
+      <w:r>
+        <w:t xml:space="preserve">Verificare · splitul</w:t>
+      </w:r>
+      <w:r>
+        <w:t xml:space="preserve"> </w:t>
+      </w:r>
+    </w:p>
+    <w:p>
+      <w:pPr>
+        <w:pStyle w:val="Heading2"/>
+      </w:pPr>
+      <w:r>
+        <w:t xml:space="preserve">Scurgerea între antrenare și test, măsurată</w:t>
+      </w:r>
+    </w:p>
+    <w:p>
+      <w:pPr>
+        <w:pStyle w:val="Normal"/>
+      </w:pPr>
+      <w:r>
+        <w:t xml:space="preserve">Mentorii au ridicat suspiciunea că splitul ar putea fi problematic. Este, dar nu în felul care schimbă concluziile.</w:t>
+      </w:r>
+    </w:p>
+    <w:tbl>
+      <w:tblPr>
+        <w:tblStyle w:val="TableGrid"/>
+        <w:tblW w:w="5000" w:type="pct"/>
+      </w:tblPr>
+      <w:tblGrid>
+        <w:gridCol w:w="4680"/>
+        <w:gridCol w:w="4680"/>
+      </w:tblGrid>
+      <w:tr>
+        <w:trPr>
+          <w:tblHeader/>
+        </w:trPr>
+        <w:tc>
+          <w:tcPr>
+            <w:tcW w:w="4680" w:type="dxa"/>
+            <w:shd w:val="clear" w:fill="F2F2F2"/>
+          </w:tcPr>
+          <w:p>
+            <w:pPr>
+              <w:pStyle w:val="Normal"/>
+            </w:pPr>
+            <w:r>
+              <w:rPr>
+                <w:b/>
+              </w:rPr>
+              <w:t xml:space="preserve">verificare</w:t>
+            </w:r>
+          </w:p>
+        </w:tc>
+        <w:tc>
+          <w:tcPr>
+            <w:tcW w:w="4680" w:type="dxa"/>
+            <w:shd w:val="clear" w:fill="F2F2F2"/>
+          </w:tcPr>
+          <w:p>
+            <w:pPr>
+              <w:pStyle w:val="Normal"/>
+            </w:pPr>
+            <w:r>
+              <w:rPr>
+                <w:b/>
+              </w:rPr>
+              <w:t xml:space="preserve">rezultat</w:t>
+            </w:r>
+          </w:p>
+        </w:tc>
+      </w:tr>
+      <w:tr>
+        <w:tc>
+          <w:tcPr>
+            <w:tcW w:w="4680" w:type="dxa"/>
+          </w:tcPr>
+          <w:p>
+            <w:pPr>
+              <w:pStyle w:val="Normal"/>
+            </w:pPr>
+            <w:r>
+              <w:t xml:space="preserve">întrebări de test identice cu unele din antrenare</w:t>
+            </w:r>
+          </w:p>
+        </w:tc>
+        <w:tc>
+          <w:tcPr>
+            <w:tcW w:w="4680" w:type="dxa"/>
+          </w:tcPr>
+          <w:p>
+            <w:pPr>
+              <w:pStyle w:val="Normal"/>
+            </w:pPr>
+            <w:r>
+              <w:t xml:space="preserve">0</w:t>
+            </w:r>
+          </w:p>
+        </w:tc>
+      </w:tr>
+      <w:tr>
+        <w:tc>
+          <w:tcPr>
+            <w:tcW w:w="4680" w:type="dxa"/>
+          </w:tcPr>
+          <w:p>
+            <w:pPr>
+              <w:pStyle w:val="Normal"/>
+            </w:pPr>
+            <w:r>
+              <w:t xml:space="preserve">idem, normalizate</w:t>
+            </w:r>
+          </w:p>
+        </w:tc>
+        <w:tc>
+          <w:tcPr>
+            <w:tcW w:w="4680" w:type="dxa"/>
+          </w:tcPr>
+          <w:p>
+            <w:pPr>
+              <w:pStyle w:val="Normal"/>
+            </w:pPr>
+            <w:r>
+              <w:t xml:space="preserve">0</w:t>
+            </w:r>
+          </w:p>
+        </w:tc>
+      </w:tr>
+      <w:tr>
+        <w:tc>
+          <w:tcPr>
+            <w:tcW w:w="4680" w:type="dxa"/>
+          </w:tcPr>
+          <w:p>
+            <w:pPr>
+              <w:pStyle w:val="Normal"/>
+            </w:pPr>
+            <w:r>
+              <w:t xml:space="preserve">întrebări aproape identice (Jaccard ≥ 0.8)</w:t>
+            </w:r>
+          </w:p>
+        </w:tc>
+        <w:tc>
+          <w:tcPr>
+            <w:tcW w:w="4680" w:type="dxa"/>
+          </w:tcPr>
+          <w:p>
+            <w:pPr>
+              <w:pStyle w:val="Normal"/>
+            </w:pPr>
+            <w:r>
+              <w:t xml:space="preserve">20 / 1 134 (1.8%)</w:t>
+            </w:r>
+          </w:p>
+        </w:tc>
+      </w:tr>
+      <w:tr>
+        <w:tc>
+          <w:tcPr>
+            <w:tcW w:w="4680" w:type="dxa"/>
+          </w:tcPr>
+          <w:p>
+            <w:pPr>
+              <w:pStyle w:val="Normal"/>
+            </w:pPr>
+            <w:r>
+              <w:t xml:space="preserve">pozitive de test folosite ca pozitive în antrenare</w:t>
+            </w:r>
+          </w:p>
+        </w:tc>
+        <w:tc>
+          <w:tcPr>
+            <w:tcW w:w="4680" w:type="dxa"/>
+          </w:tcPr>
+          <w:p>
+            <w:pPr>
+              <w:pStyle w:val="Normal"/>
+            </w:pPr>
+            <w:r>
+              <w:t xml:space="preserve">0</w:t>
+            </w:r>
+          </w:p>
+        </w:tc>
+      </w:tr>
+      <w:tr>
+        <w:tc>
+          <w:tcPr>
+            <w:tcW w:w="4680" w:type="dxa"/>
+          </w:tcPr>
+          <w:p>
+            <w:pPr>
+              <w:pStyle w:val="Normal"/>
+            </w:pPr>
+            <w:r>
+              <w:rPr>
+                <w:b/>
+              </w:rPr>
+              <w:t xml:space="preserve">pozitive de test = aceeași știre ca un pozitiv din antrenare</w:t>
+            </w:r>
+          </w:p>
+        </w:tc>
+        <w:tc>
+          <w:tcPr>
+            <w:tcW w:w="4680" w:type="dxa"/>
+          </w:tcPr>
+          <w:p>
+            <w:pPr>
+              <w:pStyle w:val="Normal"/>
+            </w:pPr>
+            <w:r>
+              <w:t xml:space="preserve">89 / 424 (21%)</w:t>
+            </w:r>
+          </w:p>
+        </w:tc>
+      </w:tr>
+      <w:tr>
+        <w:tc>
+          <w:tcPr>
+            <w:tcW w:w="4680" w:type="dxa"/>
+          </w:tcPr>
+          <w:p>
+            <w:pPr>
+              <w:pStyle w:val="Normal"/>
+            </w:pPr>
+            <w:r>
+              <w:t xml:space="preserve">pozitive de test folosite ca </w:t>
+            </w:r>
+            <w:r>
+              <w:rPr>
+                <w:i/>
+              </w:rPr>
+              <w:t xml:space="preserve">negative</w:t>
+            </w:r>
+            <w:r>
+              <w:t xml:space="preserve"> în antrenare</w:t>
+            </w:r>
+          </w:p>
+        </w:tc>
+        <w:tc>
+          <w:tcPr>
+            <w:tcW w:w="4680" w:type="dxa"/>
+          </w:tcPr>
+          <w:p>
+            <w:pPr>
+              <w:pStyle w:val="Normal"/>
+            </w:pPr>
+            <w:r>
+              <w:t xml:space="preserve">321</w:t>
+            </w:r>
+          </w:p>
+        </w:tc>
+      </w:tr>
+    </w:tbl>
+    <w:p/>
+    <w:p>
+      <w:pPr>
+        <w:pStyle w:val="Normal"/>
+      </w:pPr>
+      <w:r>
+        <w:t xml:space="preserve">Grupele de duplicate au făcut ce trebuiau: niciun document nu apare ca pozitiv de ambele părți. Dar ele prind doar fișiere aproape identice — titlu plus primele 600 de caractere. Două outleturi care publică aceeași știre primesc fingerprinturi diferite și cad în split-uri diferite. E fix fenomenul care a produs falsele negative de la început.</w:t>
+      </w:r>
+    </w:p>
+    <w:p>
+      <w:pPr>
+        <w:pStyle w:val="Heading3"/>
+      </w:pPr>
+      <w:r>
+        <w:t xml:space="preserve">Cât contează, măsurat</w:t>
+      </w:r>
+    </w:p>
+    <w:p>
+      <w:pPr>
+        <w:pStyle w:val="Normal"/>
+      </w:pPr>
+      <w:r>
+        <w:t xml:space="preserve">Am construit un set de test din care am scos toate întrebările afectate și am remăsurat:</w:t>
+      </w:r>
+    </w:p>
+    <w:tbl>
+      <w:tblPr>
+        <w:tblStyle w:val="TableGrid"/>
+        <w:tblW w:w="5000" w:type="pct"/>
+      </w:tblPr>
+      <w:tblGrid>
+        <w:gridCol w:w="2340"/>
+        <w:gridCol w:w="2340"/>
+        <w:gridCol w:w="2340"/>
+        <w:gridCol w:w="2340"/>
+      </w:tblGrid>
+      <w:tr>
+        <w:trPr>
+          <w:tblHeader/>
+        </w:trPr>
+        <w:tc>
+          <w:tcPr>
+            <w:tcW w:w="2340" w:type="dxa"/>
+            <w:shd w:val="clear" w:fill="F2F2F2"/>
+          </w:tcPr>
+          <w:p>
+            <w:pPr>
+              <w:pStyle w:val="Normal"/>
+            </w:pPr>
+            <w:r>
+              <w:rPr>
+                <w:b/>
+              </w:rPr>
+              <w:t xml:space="preserve">set de test</w:t>
+            </w:r>
+          </w:p>
+        </w:tc>
+        <w:tc>
+          <w:tcPr>
+            <w:tcW w:w="2340" w:type="dxa"/>
+            <w:shd w:val="clear" w:fill="F2F2F2"/>
+          </w:tcPr>
+          <w:p>
+            <w:pPr>
+              <w:pStyle w:val="Normal"/>
+            </w:pPr>
+            <w:r>
+              <w:rPr>
+                <w:b/>
+              </w:rPr>
+              <w:t xml:space="preserve">zero-shot</w:t>
+            </w:r>
+          </w:p>
+        </w:tc>
+        <w:tc>
+          <w:tcPr>
+            <w:tcW w:w="2340" w:type="dxa"/>
+            <w:shd w:val="clear" w:fill="F2F2F2"/>
+          </w:tcPr>
+          <w:p>
+            <w:pPr>
+              <w:pStyle w:val="Normal"/>
+            </w:pPr>
+            <w:r>
+              <w:rPr>
+                <w:b/>
+              </w:rPr>
+              <w:t xml:space="preserve">după FT</w:t>
+            </w:r>
+          </w:p>
+        </w:tc>
+        <w:tc>
+          <w:tcPr>
+            <w:tcW w:w="2340" w:type="dxa"/>
+            <w:shd w:val="clear" w:fill="F2F2F2"/>
+          </w:tcPr>
+          <w:p>
+            <w:pPr>
+              <w:pStyle w:val="Normal"/>
+            </w:pPr>
+            <w:r>
+              <w:rPr>
+                <w:b/>
+              </w:rPr>
+              <w:t xml:space="preserve">câștig</w:t>
+            </w:r>
+          </w:p>
+        </w:tc>
+      </w:tr>
+      <w:tr>
+        <w:tc>
+          <w:tcPr>
+            <w:tcW w:w="2340" w:type="dxa"/>
+          </w:tcPr>
+          <w:p>
+            <w:pPr>
+              <w:pStyle w:val="Normal"/>
+            </w:pPr>
+            <w:r>
+              <w:t xml:space="preserve">BM25, complet (1 134 întrebări)</w:t>
+            </w:r>
+          </w:p>
+        </w:tc>
+        <w:tc>
+          <w:tcPr>
+            <w:tcW w:w="2340" w:type="dxa"/>
+          </w:tcPr>
+          <w:p>
+            <w:pPr>
+              <w:pStyle w:val="Normal"/>
+            </w:pPr>
+            <w:r>
+              <w:t xml:space="preserve">0.838</w:t>
+            </w:r>
+          </w:p>
+        </w:tc>
+        <w:tc>
+          <w:tcPr>
+            <w:tcW w:w="2340" w:type="dxa"/>
+          </w:tcPr>
+          <w:p>
+            <w:pPr>
+              <w:pStyle w:val="Normal"/>
+            </w:pPr>
+            <w:r>
+              <w:t xml:space="preserve">0.905</w:t>
+            </w:r>
+          </w:p>
+        </w:tc>
+        <w:tc>
+          <w:tcPr>
+            <w:tcW w:w="2340" w:type="dxa"/>
+          </w:tcPr>
+          <w:p>
+            <w:pPr>
+              <w:pStyle w:val="Normal"/>
+            </w:pPr>
+            <w:r>
+              <w:t xml:space="preserve">+0.067</w:t>
+            </w:r>
+          </w:p>
+        </w:tc>
+      </w:tr>
+      <w:tr>
+        <w:tc>
+          <w:tcPr>
+            <w:tcW w:w="2340" w:type="dxa"/>
+          </w:tcPr>
+          <w:p>
+            <w:pPr>
+              <w:pStyle w:val="Normal"/>
+            </w:pPr>
+            <w:r>
+              <w:t xml:space="preserve">BM25, curățat (891)</w:t>
+            </w:r>
+          </w:p>
+        </w:tc>
+        <w:tc>
+          <w:tcPr>
+            <w:tcW w:w="2340" w:type="dxa"/>
+          </w:tcPr>
+          <w:p>
+            <w:pPr>
+              <w:pStyle w:val="Normal"/>
+            </w:pPr>
+            <w:r>
+              <w:t xml:space="preserve">0.857</w:t>
+            </w:r>
+          </w:p>
+        </w:tc>
+        <w:tc>
+          <w:tcPr>
+            <w:tcW w:w="2340" w:type="dxa"/>
+          </w:tcPr>
+          <w:p>
+            <w:pPr>
+              <w:pStyle w:val="Normal"/>
+            </w:pPr>
+            <w:r>
+              <w:t xml:space="preserve">0.922</w:t>
+            </w:r>
+          </w:p>
+        </w:tc>
+        <w:tc>
+          <w:tcPr>
+            <w:tcW w:w="2340" w:type="dxa"/>
+          </w:tcPr>
+          <w:p>
+            <w:pPr>
+              <w:pStyle w:val="Normal"/>
+            </w:pPr>
+            <w:r>
+              <w:t xml:space="preserve">+0.065</w:t>
+            </w:r>
+          </w:p>
+        </w:tc>
+      </w:tr>
+      <w:tr>
+        <w:tc>
+          <w:tcPr>
+            <w:tcW w:w="2340" w:type="dxa"/>
+          </w:tcPr>
+          <w:p>
+            <w:pPr>
+              <w:pStyle w:val="Normal"/>
+            </w:pPr>
+            <w:r>
+              <w:t xml:space="preserve">MaxSim, complet (1 016)</w:t>
+            </w:r>
+          </w:p>
+        </w:tc>
+        <w:tc>
+          <w:tcPr>
+            <w:tcW w:w="2340" w:type="dxa"/>
+          </w:tcPr>
+          <w:p>
+            <w:pPr>
+              <w:pStyle w:val="Normal"/>
+            </w:pPr>
+            <w:r>
+              <w:t xml:space="preserve">0.901</w:t>
+            </w:r>
+          </w:p>
+        </w:tc>
+        <w:tc>
+          <w:tcPr>
+            <w:tcW w:w="2340" w:type="dxa"/>
+          </w:tcPr>
+          <w:p>
+            <w:pPr>
+              <w:pStyle w:val="Normal"/>
+            </w:pPr>
+            <w:r>
+              <w:t xml:space="preserve">0.932</w:t>
+            </w:r>
+          </w:p>
+        </w:tc>
+        <w:tc>
+          <w:tcPr>
+            <w:tcW w:w="2340" w:type="dxa"/>
+          </w:tcPr>
+          <w:p>
+            <w:pPr>
+              <w:pStyle w:val="Normal"/>
+            </w:pPr>
+            <w:r>
+              <w:t xml:space="preserve">+0.031</w:t>
+            </w:r>
+          </w:p>
+        </w:tc>
+      </w:tr>
+      <w:tr>
+        <w:tc>
+          <w:tcPr>
+            <w:tcW w:w="2340" w:type="dxa"/>
+          </w:tcPr>
+          <w:p>
+            <w:pPr>
+              <w:pStyle w:val="Normal"/>
+            </w:pPr>
+            <w:r>
+              <w:t xml:space="preserve">MaxSim, curățat (780)</w:t>
+            </w:r>
+          </w:p>
+        </w:tc>
+        <w:tc>
+          <w:tcPr>
+            <w:tcW w:w="2340" w:type="dxa"/>
+          </w:tcPr>
+          <w:p>
+            <w:pPr>
+              <w:pStyle w:val="Normal"/>
+            </w:pPr>
+            <w:r>
+              <w:t xml:space="preserve">0.917</w:t>
+            </w:r>
+          </w:p>
+        </w:tc>
+        <w:tc>
+          <w:tcPr>
+            <w:tcW w:w="2340" w:type="dxa"/>
+          </w:tcPr>
+          <w:p>
+            <w:pPr>
+              <w:pStyle w:val="Normal"/>
+            </w:pPr>
+            <w:r>
+              <w:t xml:space="preserve">0.947</w:t>
+            </w:r>
+          </w:p>
+        </w:tc>
+        <w:tc>
+          <w:tcPr>
+            <w:tcW w:w="2340" w:type="dxa"/>
+          </w:tcPr>
+          <w:p>
+            <w:pPr>
+              <w:pStyle w:val="Normal"/>
+            </w:pPr>
+            <w:r>
+              <w:t xml:space="preserve">+0.029</w:t>
+            </w:r>
+          </w:p>
+        </w:tc>
+      </w:tr>
+    </w:tbl>
+    <w:p/>
+    <w:p>
+      <w:pPr>
+        <w:pStyle w:val="Normal"/>
+      </w:pPr>
+      <w:r>
+        <w:t xml:space="preserve">Câștigul nu se clintește: 0.001–0.002 diferență, adică zgomot.</w:t>
+      </w:r>
+    </w:p>
+    <w:p>
+      <w:pPr>
+        <w:pStyle w:val="Normal"/>
+      </w:pPr>
+      <w:r>
+        <w:t xml:space="preserve">Ambele scoruri </w:t>
+      </w:r>
+      <w:r>
+        <w:rPr>
+          <w:i/>
+        </w:rPr>
+        <w:t xml:space="preserve">urcă</w:t>
+      </w:r>
+      <w:r>
+        <w:t xml:space="preserve"> pe setul curățat, inclusiv cel zero-shot, care n-a fost antrenat pe nimic și deci nu putea profita de scurgere. Întrebările eliminate erau pur și simplu mai grele — pozitivul lor concurează în corpus cu alte articole despre aceeași știre. Modelul antrenat n-a primit niciun avantaj din faptul că văzuse acele povești.</w:t>
+      </w:r>
+    </w:p>
+    <w:p>
+      <w:pPr>
+        <w:pStyle w:val="Normal"/>
+      </w:pPr>
+      <w:r>
+        <w:t xml:space="preserve">Cele 321 de pozitive de test folosite ca negative la antrenare merită menționate separat: pentru 28% din întrebări, modelul a fost antrenat explicit să </w:t>
+      </w:r>
+      <w:r>
+        <w:rPr>
+          <w:i/>
+        </w:rPr>
+        <w:t xml:space="preserve">îndepărteze</w:t>
+      </w:r>
+      <w:r>
+        <w:t xml:space="preserve"> pasajul care e răspunsul corect la test. Asta trage scorurile în jos, nu în sus — câștigurile în domeniu sunt, dacă ceva, subestimate.</w:t>
+      </w:r>
+    </w:p>
+    <w:p>
+      <w:pPr>
+        <w:pStyle w:val="Normal"/>
+      </w:pPr>
+      <w:r>
+        <w:t xml:space="preserve">Reparația pentru o versiune viitoare: splitul pe clustere de știri, nu pe grupe de duplicate — componente conexe peste graful de suprapunere idf, cu pragul de 0.45 deja calibrat. Rezultatul principal, degradarea pe msmarco, nu e atins deloc: acel set nu împarte nimic cu splitul nostru.</w:t>
       </w:r>
     </w:p>
     <w:p>

</xml_diff>